<commit_message>
fix: read a .docx table as rows, not a line per cell
</commit_message>
<xml_diff>
--- a/e2e/fixtures/shokumu.docx
+++ b/e2e/fixtures/shokumu.docx
@@ -22,6 +22,45 @@
     <w:p/>
     <w:p>
       <w:r>
+        <w:t xml:space="preserve">職務経歴</w:t>
+      </w:r>
+    </w:p>
+    <w:tbl>
+      <w:tr>
+        <w:tc>
+          <w:p>
+            <w:r>
+              <w:t xml:space="preserve">2016年4月</w:t>
+            </w:r>
+          </w:p>
+        </w:tc>
+        <w:tc>
+          <w:p>
+            <w:r>
+              <w:t xml:space="preserve">架空物流株式会社 入社</w:t>
+            </w:r>
+          </w:p>
+        </w:tc>
+      </w:tr>
+      <w:tr>
+        <w:tc>
+          <w:p>
+            <w:r>
+              <w:t xml:space="preserve">2019年10月</w:t>
+            </w:r>
+          </w:p>
+        </w:tc>
+        <w:tc>
+          <w:p>
+            <w:r>
+              <w:t xml:space="preserve">経理システム刷新プロジェクトのリーダーを担当</w:t>
+            </w:r>
+          </w:p>
+        </w:tc>
+      </w:tr>
+    </w:tbl>
+    <w:p>
+      <w:r>
         <w:t xml:space="preserve">活かせる経験</w:t>
       </w:r>
     </w:p>

</xml_diff>